<commit_message>
Funcionamiento re integrado a inventario, correccion e implementacion de logica para editar materia prima en inventario
</commit_message>
<xml_diff>
--- a/README...Git.docx
+++ b/README...Git.docx
@@ -1,6 +1,6 @@
 
 <file path=word/document.xml><?xml version="1.0" encoding="utf-8"?>
-<w:document xmlns:wpc="http://schemas.microsoft.com/office/word/2010/wordprocessingCanvas" xmlns:cx="http://schemas.microsoft.com/office/drawing/2014/chartex" xmlns:cx1="http://schemas.microsoft.com/office/drawing/2015/9/8/chartex" xmlns:cx2="http://schemas.microsoft.com/office/drawing/2015/10/21/chartex" xmlns:cx3="http://schemas.microsoft.com/office/drawing/2016/5/9/chartex" xmlns:cx4="http://schemas.microsoft.com/office/drawing/2016/5/10/chartex" xmlns:cx5="http://schemas.microsoft.com/office/drawing/2016/5/11/chartex" xmlns:cx6="http://schemas.microsoft.com/office/drawing/2016/5/12/chartex" xmlns:cx7="http://schemas.microsoft.com/office/drawing/2016/5/13/chartex" xmlns:cx8="http://schemas.microsoft.com/office/drawing/2016/5/14/chartex" xmlns:mc="http://schemas.openxmlformats.org/markup-compatibility/2006" xmlns:aink="http://schemas.microsoft.com/office/drawing/2016/ink" xmlns:am3d="http://schemas.microsoft.com/office/drawing/2017/model3d" xmlns:o="urn:schemas-microsoft-com:office:office" xmlns:oel="http://schemas.microsoft.com/office/2019/extlst" xmlns:r="http://schemas.openxmlformats.org/officeDocument/2006/relationships" xmlns:m="http://schemas.openxmlformats.org/officeDocument/2006/math" xmlns:v="urn:schemas-microsoft-com:vml" xmlns:wp14="http://schemas.microsoft.com/office/word/2010/wordprocessingDrawing" xmlns:wp="http://schemas.openxmlformats.org/drawingml/2006/wordprocessingDrawing" xmlns:w10="urn:schemas-microsoft-com:office:word" xmlns:w="http://schemas.openxmlformats.org/wordprocessingml/2006/main" xmlns:w14="http://schemas.microsoft.com/office/word/2010/wordml" xmlns:w15="http://schemas.microsoft.com/office/word/2012/wordml" xmlns:w16cex="http://schemas.microsoft.com/office/word/2018/wordml/cex" xmlns:w16cid="http://schemas.microsoft.com/office/word/2016/wordml/cid" xmlns:w16="http://schemas.microsoft.com/office/word/2018/wordml" xmlns:w16du="http://schemas.microsoft.com/office/word/2023/wordml/word16du" xmlns:w16sdtdh="http://schemas.microsoft.com/office/word/2020/wordml/sdtdatahash" xmlns:w16sdtfl="http://schemas.microsoft.com/office/word/2024/wordml/sdtformatlock" xmlns:w16se="http://schemas.microsoft.com/office/word/2015/wordml/symex" xmlns:wpg="http://schemas.microsoft.com/office/word/2010/wordprocessingGroup" xmlns:wpi="http://schemas.microsoft.com/office/word/2010/wordprocessingInk" xmlns:wne="http://schemas.microsoft.com/office/word/2006/wordml" xmlns:wps="http://schemas.microsoft.com/office/word/2010/wordprocessingShape" mc:Ignorable="w14 w15 w16se w16cid w16 w16cex w16sdtdh w16sdtfl w16du wp14">
+<w:document xmlns:wpc="http://schemas.microsoft.com/office/word/2010/wordprocessingCanvas" xmlns:cx="http://schemas.microsoft.com/office/drawing/2014/chartex" xmlns:mc="http://schemas.openxmlformats.org/markup-compatibility/2006" xmlns:o="urn:schemas-microsoft-com:office:office" xmlns:r="http://schemas.openxmlformats.org/officeDocument/2006/relationships" xmlns:m="http://schemas.openxmlformats.org/officeDocument/2006/math" xmlns:v="urn:schemas-microsoft-com:vml" xmlns:wp14="http://schemas.microsoft.com/office/word/2010/wordprocessingDrawing" xmlns:wp="http://schemas.openxmlformats.org/drawingml/2006/wordprocessingDrawing" xmlns:w10="urn:schemas-microsoft-com:office:word" xmlns:w="http://schemas.openxmlformats.org/wordprocessingml/2006/main" xmlns:w14="http://schemas.microsoft.com/office/word/2010/wordml" xmlns:w15="http://schemas.microsoft.com/office/word/2012/wordml" xmlns:w16se="http://schemas.microsoft.com/office/word/2015/wordml/symex" xmlns:wpg="http://schemas.microsoft.com/office/word/2010/wordprocessingGroup" xmlns:wpi="http://schemas.microsoft.com/office/word/2010/wordprocessingInk" xmlns:wne="http://schemas.microsoft.com/office/word/2006/wordml" xmlns:wps="http://schemas.microsoft.com/office/word/2010/wordprocessingShape" mc:Ignorable="w14 w15 w16se wp14">
   <w:body>
     <w:p>
       <w:pPr>
@@ -55,6 +55,10 @@
         <w:pStyle w:val="I3E-Normal"/>
       </w:pPr>
       <w:r>
+        <w:rPr>
+          <w:noProof/>
+          <w:lang w:val="en-US" w:eastAsia="en-US"/>
+        </w:rPr>
         <w:drawing>
           <wp:inline distT="0" distB="0" distL="0" distR="0" wp14:anchorId="16EE54C4" wp14:editId="733A84E5">
             <wp:extent cx="6151880" cy="5608955"/>
@@ -74,7 +78,7 @@
                     <a:blip r:embed="rId7">
                       <a:extLst>
                         <a:ext uri="{96DAC541-7B7A-43D3-8B79-37D633B846F1}">
-                          <asvg:svgBlip xmlns:asvg="http://schemas.microsoft.com/office/drawing/2016/SVG/main" r:embed="rId8"/>
+                          <asvg:svgBlip xmlns:asvg="http://schemas.microsoft.com/office/drawing/2016/SVG/main" xmlns:w16sdtfl="http://schemas.microsoft.com/office/word/2024/wordml/sdtformatlock" xmlns:w16sdtdh="http://schemas.microsoft.com/office/word/2020/wordml/sdtdatahash" xmlns:w16du="http://schemas.microsoft.com/office/word/2023/wordml/word16du" xmlns:w16="http://schemas.microsoft.com/office/word/2018/wordml" xmlns:w16cid="http://schemas.microsoft.com/office/word/2016/wordml/cid" xmlns:w16cex="http://schemas.microsoft.com/office/word/2018/wordml/cex" xmlns:w="http://schemas.openxmlformats.org/wordprocessingml/2006/main" xmlns:w10="urn:schemas-microsoft-com:office:word" xmlns:v="urn:schemas-microsoft-com:vml" xmlns:oel="http://schemas.microsoft.com/office/2019/extlst" xmlns:o="urn:schemas-microsoft-com:office:office" xmlns:am3d="http://schemas.microsoft.com/office/drawing/2017/model3d" xmlns:aink="http://schemas.microsoft.com/office/drawing/2016/ink" xmlns:cx8="http://schemas.microsoft.com/office/drawing/2016/5/14/chartex" xmlns:cx7="http://schemas.microsoft.com/office/drawing/2016/5/13/chartex" xmlns:cx6="http://schemas.microsoft.com/office/drawing/2016/5/12/chartex" xmlns:cx5="http://schemas.microsoft.com/office/drawing/2016/5/11/chartex" xmlns:cx4="http://schemas.microsoft.com/office/drawing/2016/5/10/chartex" xmlns:cx3="http://schemas.microsoft.com/office/drawing/2016/5/9/chartex" xmlns:cx2="http://schemas.microsoft.com/office/drawing/2015/10/21/chartex" xmlns:cx1="http://schemas.microsoft.com/office/drawing/2015/9/8/chartex" xmlns="" r:embed="rId8"/>
                         </a:ext>
                       </a:extLst>
                     </a:blip>
@@ -101,6 +105,48 @@
     <w:p>
       <w:pPr>
         <w:pStyle w:val="I3E-Normal"/>
+        <w:rPr>
+          <w:bCs/>
+        </w:rPr>
+      </w:pPr>
+      <w:r>
+        <w:rPr>
+          <w:bCs/>
+        </w:rPr>
+        <w:t>Después de analizar</w:t>
+      </w:r>
+      <w:r>
+        <w:rPr>
+          <w:bCs/>
+        </w:rPr>
+        <w:t xml:space="preserve"> detenidamente el video: </w:t>
+      </w:r>
+      <w:hyperlink r:id="rId9" w:history="1">
+        <w:r>
+          <w:rPr>
+            <w:rStyle w:val="Hipervnculo"/>
+            <w:bCs/>
+          </w:rPr>
+          <w:t>https://www.youtube.com/watch?v=ppiARvOnP6M</w:t>
+        </w:r>
+      </w:hyperlink>
+      <w:r>
+        <w:rPr>
+          <w:bCs/>
+        </w:rPr>
+        <w:t>. (recomiendo verlo)</w:t>
+      </w:r>
+      <w:r>
+        <w:rPr>
+          <w:bCs/>
+        </w:rPr>
+        <w:br/>
+        <w:t>aquí dejare las definiciones en base a lo que usaremos la metodología de ramas Git Flow para el proyecto casercon</w:t>
+      </w:r>
+    </w:p>
+    <w:p>
+      <w:pPr>
+        <w:pStyle w:val="I3E-Normal"/>
       </w:pPr>
       <w:r>
         <w:rPr>
@@ -110,7 +156,10 @@
         <w:t>Rama main</w:t>
       </w:r>
       <w:r>
-        <w:t xml:space="preserve"> — es la rama sagrada. Representa el código que está en producción (o listo para producción). Nunca se trabaja directamente aquí. Solo recibe merges desde qa cuando algo ya fue probado y aprobado.</w:t>
+        <w:t xml:space="preserve"> — es la rama sagrada.</w:t>
+      </w:r>
+      <w:r>
+        <w:t xml:space="preserve"> Representa el código estable del programa, de esta rama se condensan las demás, por lo tanto no se puede utilizar hasta cumplir un proceso con las todas las ramas</w:t>
       </w:r>
     </w:p>
     <w:p>
@@ -120,12 +169,11 @@
       <w:r>
         <w:rPr>
           <w:b/>
-          <w:bCs/>
-        </w:rPr>
-        <w:t>Rama develop</w:t>
-      </w:r>
-      <w:r>
-        <w:t xml:space="preserve"> — es la rama de integración del equipo. Todos los features terminados llegan aquí primero. Es el estado "más reciente del trabajo combinado", pero no necesariamente estable al 100%.</w:t>
+        </w:rPr>
+        <w:t>Rama Develop</w:t>
+      </w:r>
+      <w:r>
+        <w:t xml:space="preserve"> - es la rama de integración para el desarrollo, esta trabaja de la mano con las ramas temporales para poder integrar nuevas características de un módulo o funcionalidad del sistema.</w:t>
       </w:r>
     </w:p>
     <w:p>
@@ -135,291 +183,260 @@
       <w:r>
         <w:rPr>
           <w:b/>
-          <w:bCs/>
-        </w:rPr>
-        <w:t>Ramas feature/*</w:t>
-      </w:r>
-      <w:r>
-        <w:t xml:space="preserve"> — son temporales. Cada funcionalidad nueva nace como una rama separada creada desde develop. Cuando termina, se fusiona de vuelta a develop mediante un </w:t>
-      </w:r>
+        </w:rPr>
+        <w:t>Rama Feature</w:t>
+      </w:r>
+      <w:r>
+        <w:t xml:space="preserve"> – es la rama temporal que se crea para introducir una funcionalidad a develop</w:t>
+      </w:r>
+    </w:p>
+    <w:p>
+      <w:pPr>
+        <w:pStyle w:val="I3E-Normal"/>
+      </w:pPr>
       <w:r>
         <w:rPr>
           <w:b/>
-          <w:bCs/>
-        </w:rPr>
-        <w:t>Pull Request</w:t>
-      </w:r>
-      <w:r>
-        <w:t xml:space="preserve"> y luego se elimina. El nombre convencional es feature/nombre-descriptivo, por ejemplo feature/login, feature/modulo-produccion.</w:t>
-      </w:r>
-    </w:p>
-    <w:p>
-      <w:pPr>
-        <w:pStyle w:val="I3E-Normal"/>
-      </w:pPr>
+        </w:rPr>
+        <w:lastRenderedPageBreak/>
+        <w:t xml:space="preserve">Rama </w:t>
+      </w:r>
       <w:r>
         <w:rPr>
           <w:b/>
-          <w:bCs/>
-        </w:rPr>
-        <w:lastRenderedPageBreak/>
-        <w:t>Rama qa</w:t>
-      </w:r>
-      <w:r>
-        <w:t xml:space="preserve"> — es el ambiente de pruebas. Cuando develop tiene un conjunto de features listos para revisar, se hace un merge a qa. Aquí el tester (o tú mismo) valida que todo funcione correctamente. Si algo falla, se corrige en develop y se vuelve a mergear.</w:t>
-      </w:r>
-    </w:p>
-    <w:p>
-      <w:pPr>
-        <w:pStyle w:val="I3E-Normal"/>
-      </w:pPr>
-      <w:r>
-        <w:t>FLUJO PASO A PASO EN COMANDOS</w:t>
-      </w:r>
-    </w:p>
-    <w:p>
-      <w:pPr>
-        <w:pStyle w:val="I3E-Normal"/>
-        <w:rPr>
-          <w:lang w:val="en-US"/>
-        </w:rPr>
-      </w:pPr>
-      <w:r>
-        <w:rPr>
-          <w:lang w:val="en-US"/>
-        </w:rPr>
-        <w:t># 1. Crear un feature desde develop</w:t>
-      </w:r>
-    </w:p>
-    <w:p>
-      <w:pPr>
-        <w:pStyle w:val="I3E-Normal"/>
-        <w:rPr>
-          <w:lang w:val="en-US"/>
-        </w:rPr>
-      </w:pPr>
-      <w:r>
-        <w:rPr>
-          <w:lang w:val="en-US"/>
-        </w:rPr>
-        <w:t>git checkout develop</w:t>
-      </w:r>
-    </w:p>
-    <w:p>
-      <w:pPr>
-        <w:pStyle w:val="I3E-Normal"/>
-      </w:pPr>
-      <w:r>
-        <w:t>git checkout -b feature/mi-funcionalidad</w:t>
-      </w:r>
-    </w:p>
-    <w:p>
-      <w:pPr>
-        <w:pStyle w:val="I3E-Normal"/>
-      </w:pPr>
-    </w:p>
-    <w:p>
-      <w:pPr>
-        <w:pStyle w:val="I3E-Normal"/>
-      </w:pPr>
-      <w:r>
-        <w:t># 2. Trabajar y hacer commits</w:t>
-      </w:r>
-    </w:p>
-    <w:p>
-      <w:pPr>
-        <w:pStyle w:val="I3E-Normal"/>
-      </w:pPr>
-      <w:r>
-        <w:t>git add .</w:t>
-      </w:r>
-    </w:p>
-    <w:p>
-      <w:pPr>
-        <w:pStyle w:val="I3E-Normal"/>
-      </w:pPr>
-      <w:r>
-        <w:t>git commit -m "feat: descripción del cambio"</w:t>
-      </w:r>
-    </w:p>
-    <w:p>
-      <w:pPr>
-        <w:pStyle w:val="I3E-Normal"/>
-      </w:pPr>
-    </w:p>
-    <w:p>
-      <w:pPr>
-        <w:pStyle w:val="I3E-Normal"/>
-      </w:pPr>
-      <w:r>
-        <w:t># 3. Cuando terminas, subir y hacer PR a develop</w:t>
-      </w:r>
-    </w:p>
-    <w:p>
-      <w:pPr>
-        <w:pStyle w:val="I3E-Normal"/>
-      </w:pPr>
-      <w:r>
-        <w:t>git push origin feature/mi-funcionalidad</w:t>
-      </w:r>
-    </w:p>
-    <w:p>
-      <w:pPr>
-        <w:pStyle w:val="I3E-Normal"/>
-      </w:pPr>
-      <w:r>
-        <w:t># → Crear Pull Request en GitHub hacia develop</w:t>
-      </w:r>
-    </w:p>
-    <w:p>
-      <w:pPr>
-        <w:pStyle w:val="I3E-Normal"/>
-      </w:pPr>
-      <w:r>
-        <w:t># → Revisar, aprobar y mergear</w:t>
-      </w:r>
-    </w:p>
-    <w:p>
-      <w:pPr>
-        <w:pStyle w:val="I3E-Normal"/>
-      </w:pPr>
-      <w:r>
-        <w:t># → Eliminar la rama feature desde GitHub (o con git branch -d)</w:t>
-      </w:r>
-    </w:p>
-    <w:p>
-      <w:pPr>
-        <w:pStyle w:val="I3E-Normal"/>
-      </w:pPr>
-    </w:p>
-    <w:p>
-      <w:pPr>
-        <w:pStyle w:val="I3E-Normal"/>
-      </w:pPr>
-      <w:r>
-        <w:t># 4. Cuando develop está listo para pruebas</w:t>
-      </w:r>
-    </w:p>
-    <w:p>
-      <w:pPr>
-        <w:pStyle w:val="I3E-Normal"/>
-        <w:rPr>
-          <w:lang w:val="en-US"/>
-        </w:rPr>
-      </w:pPr>
-      <w:r>
-        <w:rPr>
-          <w:lang w:val="en-US"/>
-        </w:rPr>
-        <w:t>git checkout qa</w:t>
-      </w:r>
-    </w:p>
-    <w:p>
-      <w:pPr>
-        <w:pStyle w:val="I3E-Normal"/>
-        <w:rPr>
-          <w:lang w:val="en-US"/>
-        </w:rPr>
-      </w:pPr>
-      <w:r>
-        <w:rPr>
-          <w:lang w:val="en-US"/>
-        </w:rPr>
-        <w:t>git merge develop</w:t>
-      </w:r>
-    </w:p>
-    <w:p>
-      <w:pPr>
-        <w:pStyle w:val="I3E-Normal"/>
-      </w:pPr>
-      <w:r>
-        <w:t>git push origin qa</w:t>
-      </w:r>
-    </w:p>
-    <w:p>
-      <w:pPr>
-        <w:pStyle w:val="I3E-Normal"/>
-      </w:pPr>
-    </w:p>
-    <w:p>
-      <w:pPr>
-        <w:pStyle w:val="I3E-Normal"/>
-      </w:pPr>
-      <w:r>
-        <w:t># 5. Cuando QA aprueba todo</w:t>
-      </w:r>
-    </w:p>
-    <w:p>
-      <w:pPr>
-        <w:pStyle w:val="I3E-Normal"/>
-        <w:rPr>
-          <w:lang w:val="en-US"/>
-        </w:rPr>
-      </w:pPr>
-      <w:r>
-        <w:rPr>
-          <w:lang w:val="en-US"/>
-        </w:rPr>
-        <w:t>git checkout main</w:t>
-      </w:r>
-    </w:p>
-    <w:p>
-      <w:pPr>
-        <w:pStyle w:val="I3E-Normal"/>
-        <w:rPr>
-          <w:lang w:val="en-US"/>
-        </w:rPr>
-      </w:pPr>
-      <w:r>
-        <w:rPr>
-          <w:lang w:val="en-US"/>
-        </w:rPr>
-        <w:t>git merge qa</w:t>
-      </w:r>
-    </w:p>
-    <w:p>
-      <w:pPr>
-        <w:pStyle w:val="I3E-Normal"/>
-      </w:pPr>
-      <w:r>
-        <w:t>git push origin main</w:t>
-      </w:r>
-    </w:p>
-    <w:p>
-      <w:pPr>
-        <w:pStyle w:val="I3E-Normal"/>
-      </w:pPr>
-      <w:r>
-        <w:t>git tag v1.0.0  # opcional pero recomendado</w:t>
-      </w:r>
-    </w:p>
-    <w:p>
-      <w:pPr>
-        <w:pStyle w:val="I3E-Normal"/>
-      </w:pPr>
-      <w:r>
-        <w:t>TOMAR EN CUENTA</w:t>
-      </w:r>
-    </w:p>
-    <w:p>
-      <w:pPr>
-        <w:pStyle w:val="I3E-Normal"/>
-      </w:pPr>
-      <w:r>
-        <w:t>Cada persona no tiene su propio develop. Lo que tienen es su propia rama feature/* nombrada por la funcionalidad que están desarrollando, no por quién la hace. Esto es importante porque si dos personas trabajan en el mismo módulo, colaboran en la misma rama feature.</w:t>
-      </w:r>
-    </w:p>
-    <w:p>
-      <w:pPr>
-        <w:pStyle w:val="I3E-Normal"/>
-      </w:pPr>
-      <w:r>
-        <w:lastRenderedPageBreak/>
+        </w:rPr>
+        <w:t>QA (reléase)</w:t>
+      </w:r>
+      <w:r>
+        <w:t xml:space="preserve"> – Esta rama se crea a base de develop ya que se usa para poder validar todas las funcionalidades que requiere el sistema para considerar una funcionalidad finalizada, cuando esté listo se podrá subir a main.</w:t>
+      </w:r>
+    </w:p>
+    <w:p>
+      <w:pPr>
+        <w:pStyle w:val="I3E-Normal"/>
+        <w:ind w:firstLine="0"/>
+      </w:pPr>
+    </w:p>
+    <w:p>
+      <w:pPr>
+        <w:pStyle w:val="I3E-Normal"/>
+        <w:ind w:firstLine="0"/>
+      </w:pPr>
+      <w:r>
+        <w:t>PROCESO PASO A PASO EN BASE AL PROYECTO…</w:t>
+      </w:r>
+    </w:p>
+    <w:p>
+      <w:pPr>
+        <w:pStyle w:val="I3E-Normal"/>
+        <w:ind w:firstLine="0"/>
+        <w:rPr>
+          <w:b/>
+        </w:rPr>
+      </w:pPr>
+      <w:r>
+        <w:rPr>
+          <w:b/>
+        </w:rPr>
+        <w:t xml:space="preserve">PASO 1 </w:t>
+      </w:r>
+      <w:r>
+        <w:rPr>
+          <w:b/>
+        </w:rPr>
+        <w:t>INSTALACION</w:t>
+      </w:r>
+    </w:p>
+    <w:p>
+      <w:pPr>
+        <w:pStyle w:val="I3E-Normal"/>
+        <w:ind w:firstLine="0"/>
+      </w:pPr>
+      <w:r>
+        <w:t>Antes de trabajar con git flow tenemos que tenerlo instalado, para esto nos vamos a ejecutar como administrador el git bash o cualquier terminal de Windows como powershell o cmd e ingresaremos el siguiente comando.</w:t>
+      </w:r>
+    </w:p>
+    <w:p>
+      <w:pPr>
+        <w:pStyle w:val="I3E-Normal"/>
+        <w:jc w:val="center"/>
+        <w:rPr>
+          <w:lang w:val="en-US"/>
+        </w:rPr>
+      </w:pPr>
+      <w:r>
+        <w:rPr>
+          <w:lang w:val="en-US"/>
+        </w:rPr>
+        <w:t>“</w:t>
+      </w:r>
+      <w:r>
+        <w:rPr>
+          <w:lang w:val="en-US"/>
+        </w:rPr>
+        <w:t>curl -OL https://raw.githubusercontent.com/petervanderdoes/gitflow-avh/develop/contrib/gitflow-installer.sh</w:t>
+      </w:r>
+    </w:p>
+    <w:p>
+      <w:pPr>
+        <w:pStyle w:val="I3E-Normal"/>
+        <w:ind w:firstLine="0"/>
+        <w:jc w:val="center"/>
+        <w:rPr>
+          <w:lang w:val="en-US"/>
+        </w:rPr>
+      </w:pPr>
+      <w:r>
+        <w:rPr>
+          <w:lang w:val="en-US"/>
+        </w:rPr>
+        <w:t>bash gitflow-installer.sh install stable</w:t>
+      </w:r>
+      <w:r>
+        <w:rPr>
+          <w:lang w:val="en-US"/>
+        </w:rPr>
+        <w:t>”</w:t>
+      </w:r>
+    </w:p>
+    <w:p>
+      <w:pPr>
+        <w:pStyle w:val="I3E-Normal"/>
+        <w:ind w:firstLine="0"/>
+      </w:pPr>
+      <w:r>
+        <w:t>si se encuentra un problema con la instalación es porque falta choco</w:t>
+      </w:r>
+      <w:r>
+        <w:t>latey que es un gestor de paquetes por línea de comandos para Window.</w:t>
+      </w:r>
+    </w:p>
+    <w:p>
+      <w:pPr>
+        <w:pStyle w:val="I3E-Normal"/>
+        <w:jc w:val="center"/>
+        <w:rPr>
+          <w:lang w:val="en-US"/>
+        </w:rPr>
+      </w:pPr>
+      <w:r>
+        <w:rPr>
+          <w:lang w:val="en-US"/>
+        </w:rPr>
+        <w:t>Se instala con este código:</w:t>
+      </w:r>
+    </w:p>
+    <w:p>
+      <w:pPr>
+        <w:pStyle w:val="I3E-Normal"/>
+        <w:jc w:val="center"/>
+        <w:rPr>
+          <w:lang w:val="en-US"/>
+        </w:rPr>
+      </w:pPr>
+      <w:r>
+        <w:rPr>
+          <w:lang w:val="en-US"/>
+        </w:rPr>
+        <w:t>“</w:t>
+      </w:r>
+      <w:r>
+        <w:rPr>
+          <w:lang w:val="en-US"/>
+        </w:rPr>
+        <w:t>Set-ExecutionPolicy Bypass -Scope Process -Force; `</w:t>
+      </w:r>
+    </w:p>
+    <w:p>
+      <w:pPr>
+        <w:pStyle w:val="I3E-Normal"/>
+        <w:jc w:val="center"/>
+        <w:rPr>
+          <w:lang w:val="en-US"/>
+        </w:rPr>
+      </w:pPr>
+      <w:r>
+        <w:rPr>
+          <w:lang w:val="en-US"/>
+        </w:rPr>
+        <w:t>[System.Net.ServicePointManager]::SecurityProtocol = `</w:t>
+      </w:r>
+    </w:p>
+    <w:p>
+      <w:pPr>
+        <w:pStyle w:val="I3E-Normal"/>
+        <w:jc w:val="center"/>
+        <w:rPr>
+          <w:lang w:val="en-US"/>
+        </w:rPr>
+      </w:pPr>
+      <w:r>
+        <w:rPr>
+          <w:lang w:val="en-US"/>
+        </w:rPr>
+        <w:t>[System.Net.ServicePointManager]::SecurityProtocol -bor 3072; `</w:t>
+      </w:r>
+    </w:p>
+    <w:p>
+      <w:pPr>
+        <w:pStyle w:val="I3E-Normal"/>
+        <w:ind w:firstLine="0"/>
+        <w:jc w:val="center"/>
+        <w:rPr>
+          <w:lang w:val="en-US"/>
+        </w:rPr>
+      </w:pPr>
+      <w:r>
+        <w:rPr>
+          <w:lang w:val="en-US"/>
+        </w:rPr>
+        <w:t>iex ((New-Object System.Net.WebClient).DownloadString('https://community.chocolatey.org/install.ps1'))</w:t>
+      </w:r>
+      <w:r>
+        <w:rPr>
+          <w:lang w:val="en-US"/>
+        </w:rPr>
+        <w:t>”</w:t>
+      </w:r>
+    </w:p>
+    <w:p>
+      <w:pPr>
+        <w:pStyle w:val="I3E-Normal"/>
+        <w:ind w:firstLine="0"/>
+        <w:jc w:val="left"/>
+      </w:pPr>
+      <w:r>
+        <w:t>al instalar correctamente git flow probaremos su</w:t>
+      </w:r>
+      <w:r>
+        <w:t xml:space="preserve"> versión con el siguiente código:</w:t>
+      </w:r>
+      <w:r>
+        <w:t xml:space="preserve"> </w:t>
+      </w:r>
+    </w:p>
+    <w:p>
+      <w:pPr>
+        <w:pStyle w:val="I3E-Normal"/>
+        <w:ind w:firstLine="0"/>
+        <w:jc w:val="left"/>
+      </w:pPr>
+      <w:r>
+        <w:t xml:space="preserve">“git flow version” si la instalación fue exitosa entonces saldrá esto </w:t>
+      </w:r>
+    </w:p>
+    <w:p>
+      <w:pPr>
+        <w:pStyle w:val="I3E-Normal"/>
+        <w:ind w:firstLine="0"/>
+        <w:jc w:val="center"/>
+      </w:pPr>
+      <w:r>
         <w:drawing>
-          <wp:inline distT="0" distB="0" distL="0" distR="0" wp14:anchorId="4BB33738" wp14:editId="5804DA9B">
-            <wp:extent cx="6151880" cy="4885055"/>
+          <wp:inline distT="0" distB="0" distL="0" distR="0" wp14:anchorId="4A355345" wp14:editId="7AC84851">
+            <wp:extent cx="2648320" cy="285790"/>
             <wp:effectExtent l="0" t="0" r="0" b="0"/>
-            <wp:docPr id="914858329" name="Graphic 1"/>
+            <wp:docPr id="2" name="Imagen 2"/>
             <wp:cNvGraphicFramePr>
               <a:graphicFrameLocks xmlns:a="http://schemas.openxmlformats.org/drawingml/2006/main" noChangeAspect="1"/>
             </wp:cNvGraphicFramePr>
@@ -427,14 +444,14 @@
               <a:graphicData uri="http://schemas.openxmlformats.org/drawingml/2006/picture">
                 <pic:pic xmlns:pic="http://schemas.openxmlformats.org/drawingml/2006/picture">
                   <pic:nvPicPr>
-                    <pic:cNvPr id="914858329" name=""/>
+                    <pic:cNvPr id="1" name=""/>
                     <pic:cNvPicPr/>
                   </pic:nvPicPr>
                   <pic:blipFill>
-                    <a:blip r:embed="rId9">
+                    <a:blip r:embed="rId10">
                       <a:extLst>
-                        <a:ext uri="{96DAC541-7B7A-43D3-8B79-37D633B846F1}">
-                          <asvg:svgBlip xmlns:asvg="http://schemas.microsoft.com/office/drawing/2016/SVG/main" r:embed="rId10"/>
+                        <a:ext uri="{28A0092B-C50C-407E-A947-70E740481C1C}">
+                          <a14:useLocalDpi xmlns:a14="http://schemas.microsoft.com/office/drawing/2010/main" val="0"/>
                         </a:ext>
                       </a:extLst>
                     </a:blip>
@@ -445,7 +462,7 @@
                   <pic:spPr>
                     <a:xfrm>
                       <a:off x="0" y="0"/>
-                      <a:ext cx="6151880" cy="4885055"/>
+                      <a:ext cx="2648320" cy="285790"/>
                     </a:xfrm>
                     <a:prstGeom prst="rect">
                       <a:avLst/>
@@ -461,136 +478,34 @@
     <w:p>
       <w:pPr>
         <w:pStyle w:val="I3E-Normal"/>
-      </w:pPr>
-      <w:r>
-        <w:t># Todos parten desde develop actualizado</w:t>
-      </w:r>
-    </w:p>
-    <w:p>
-      <w:pPr>
-        <w:pStyle w:val="I3E-Normal"/>
-      </w:pPr>
-      <w:r>
-        <w:t>git checkout develop</w:t>
-      </w:r>
-    </w:p>
-    <w:p>
-      <w:pPr>
-        <w:pStyle w:val="I3E-Normal"/>
-      </w:pPr>
-      <w:r>
-        <w:t>git pull origin develop        # importante: siempre jalá lo último</w:t>
-      </w:r>
-    </w:p>
-    <w:p>
-      <w:pPr>
-        <w:pStyle w:val="I3E-Normal"/>
-      </w:pPr>
-    </w:p>
-    <w:p>
-      <w:pPr>
-        <w:pStyle w:val="I3E-Normal"/>
-      </w:pPr>
-      <w:r>
-        <w:t># Cada uno crea SU feature</w:t>
-      </w:r>
-    </w:p>
-    <w:p>
-      <w:pPr>
-        <w:pStyle w:val="I3E-Normal"/>
-        <w:rPr>
-          <w:lang w:val="en-US"/>
-        </w:rPr>
-      </w:pPr>
-      <w:r>
-        <w:rPr>
-          <w:lang w:val="en-US"/>
-        </w:rPr>
-        <w:t>git checkout -b feature/mi-modulo</w:t>
-      </w:r>
-    </w:p>
-    <w:p>
-      <w:pPr>
-        <w:pStyle w:val="I3E-Normal"/>
-        <w:rPr>
-          <w:lang w:val="en-US"/>
-        </w:rPr>
-      </w:pPr>
-    </w:p>
-    <w:p>
-      <w:pPr>
-        <w:pStyle w:val="I3E-Normal"/>
-      </w:pPr>
-      <w:r>
-        <w:t># ... trabajan, hacen commits ...</w:t>
-      </w:r>
-    </w:p>
-    <w:p>
-      <w:pPr>
-        <w:pStyle w:val="I3E-Normal"/>
-      </w:pPr>
-    </w:p>
-    <w:p>
-      <w:pPr>
-        <w:pStyle w:val="I3E-Normal"/>
-      </w:pPr>
-      <w:r>
-        <w:t># Cuando terminan, suben su feature y hacen PR hacia develop</w:t>
-      </w:r>
-    </w:p>
-    <w:p>
-      <w:pPr>
-        <w:pStyle w:val="I3E-Normal"/>
-        <w:rPr>
-          <w:lang w:val="en-US"/>
-        </w:rPr>
-      </w:pPr>
-      <w:r>
-        <w:rPr>
-          <w:lang w:val="en-US"/>
-        </w:rPr>
-        <w:t>git push origin feature/mi-modulo</w:t>
-      </w:r>
-    </w:p>
-    <w:p>
-      <w:pPr>
-        <w:pStyle w:val="I3E-Normal"/>
-        <w:rPr>
-          <w:lang w:val="en-US"/>
-        </w:rPr>
-      </w:pPr>
-    </w:p>
-    <w:p>
-      <w:pPr>
-        <w:pStyle w:val="I3E-Normal"/>
-        <w:rPr>
-          <w:lang w:val="en-US"/>
-        </w:rPr>
-      </w:pPr>
-      <w:r>
-        <w:rPr>
-          <w:lang w:val="en-US"/>
-        </w:rPr>
-        <w:t>VISUALIZACION GIT HUB</w:t>
-      </w:r>
-    </w:p>
-    <w:p>
-      <w:pPr>
-        <w:pStyle w:val="I3E-Normal"/>
-        <w:rPr>
-          <w:lang w:val="en-US"/>
-        </w:rPr>
-      </w:pPr>
-      <w:r>
-        <w:rPr>
-          <w:lang w:val="en-US"/>
-        </w:rPr>
-        <w:lastRenderedPageBreak/>
+        <w:ind w:firstLine="0"/>
+        <w:jc w:val="left"/>
+      </w:pPr>
+      <w:r>
+        <w:t>PASO 2 CONFIGURACION DE GITFLOW</w:t>
+      </w:r>
+    </w:p>
+    <w:p>
+      <w:pPr>
+        <w:pStyle w:val="I3E-Normal"/>
+        <w:ind w:firstLine="0"/>
+      </w:pPr>
+      <w:r>
+        <w:t>Actualmente el proyecto ya presenta el repositorio con su rama main creada</w:t>
+      </w:r>
+    </w:p>
+    <w:p>
+      <w:pPr>
+        <w:pStyle w:val="I3E-Normal"/>
+        <w:ind w:firstLine="0"/>
+        <w:jc w:val="center"/>
+      </w:pPr>
+      <w:r>
         <w:drawing>
-          <wp:inline distT="0" distB="0" distL="0" distR="0" wp14:anchorId="44F26252" wp14:editId="5FF142E0">
-            <wp:extent cx="6151880" cy="3071495"/>
-            <wp:effectExtent l="0" t="0" r="1270" b="0"/>
-            <wp:docPr id="211442516" name="Picture 1"/>
+          <wp:inline distT="0" distB="0" distL="0" distR="0" wp14:anchorId="36D67889" wp14:editId="5CDAF290">
+            <wp:extent cx="1219370" cy="1228896"/>
+            <wp:effectExtent l="0" t="0" r="0" b="9525"/>
+            <wp:docPr id="1" name="Imagen 1"/>
             <wp:cNvGraphicFramePr>
               <a:graphicFrameLocks xmlns:a="http://schemas.openxmlformats.org/drawingml/2006/main" noChangeAspect="1"/>
             </wp:cNvGraphicFramePr>
@@ -598,11 +513,17 @@
               <a:graphicData uri="http://schemas.openxmlformats.org/drawingml/2006/picture">
                 <pic:pic xmlns:pic="http://schemas.openxmlformats.org/drawingml/2006/picture">
                   <pic:nvPicPr>
-                    <pic:cNvPr id="211442516" name=""/>
+                    <pic:cNvPr id="1" name=""/>
                     <pic:cNvPicPr/>
                   </pic:nvPicPr>
                   <pic:blipFill>
-                    <a:blip r:embed="rId11"/>
+                    <a:blip r:embed="rId11">
+                      <a:extLst>
+                        <a:ext uri="{28A0092B-C50C-407E-A947-70E740481C1C}">
+                          <a14:useLocalDpi xmlns:a14="http://schemas.microsoft.com/office/drawing/2010/main" val="0"/>
+                        </a:ext>
+                      </a:extLst>
+                    </a:blip>
                     <a:stretch>
                       <a:fillRect/>
                     </a:stretch>
@@ -610,7 +531,7 @@
                   <pic:spPr>
                     <a:xfrm>
                       <a:off x="0" y="0"/>
-                      <a:ext cx="6151880" cy="3071495"/>
+                      <a:ext cx="1219370" cy="1228896"/>
                     </a:xfrm>
                     <a:prstGeom prst="rect">
                       <a:avLst/>
@@ -626,19 +547,51 @@
     <w:p>
       <w:pPr>
         <w:pStyle w:val="I3E-Normal"/>
-        <w:rPr>
-          <w:lang w:val="en-US"/>
-        </w:rPr>
-      </w:pPr>
-      <w:r>
-        <w:rPr>
-          <w:lang w:val="en-US"/>
-        </w:rPr>
+        <w:ind w:firstLine="0"/>
+        <w:jc w:val="left"/>
+      </w:pPr>
+      <w:r>
+        <w:t>Para un nuevo proyecto debe de tener al menos una carpeta, el respectivo git init y tener la ruta de github.</w:t>
+      </w:r>
+    </w:p>
+    <w:p>
+      <w:pPr>
+        <w:pStyle w:val="I3E-Normal"/>
+        <w:ind w:firstLine="0"/>
+        <w:jc w:val="left"/>
+      </w:pPr>
+      <w:r>
+        <w:t>Para empezar a trabajar con git flow, entraremos con git ba</w:t>
+      </w:r>
+      <w:r>
+        <w:t>s</w:t>
+      </w:r>
+      <w:r>
+        <w:t>h a la carpeta y al verificar que nos encontremos en la ruta correcta pondremos en la terminal lo siguiente</w:t>
+      </w:r>
+    </w:p>
+    <w:p>
+      <w:pPr>
+        <w:pStyle w:val="I3E-Normal"/>
+        <w:ind w:firstLine="0"/>
+        <w:jc w:val="left"/>
+      </w:pPr>
+      <w:r>
+        <w:t>“git flow init”</w:t>
+      </w:r>
+    </w:p>
+    <w:p>
+      <w:pPr>
+        <w:pStyle w:val="I3E-Normal"/>
+        <w:ind w:firstLine="0"/>
+        <w:jc w:val="center"/>
+      </w:pPr>
+      <w:r>
         <w:drawing>
-          <wp:inline distT="0" distB="0" distL="0" distR="0" wp14:anchorId="1EF69CF5" wp14:editId="6698542B">
-            <wp:extent cx="6151880" cy="3185160"/>
-            <wp:effectExtent l="0" t="0" r="1270" b="0"/>
-            <wp:docPr id="2074597179" name="Picture 1"/>
+          <wp:inline distT="0" distB="0" distL="0" distR="0" wp14:anchorId="1A9CEF3E" wp14:editId="1192DCC4">
+            <wp:extent cx="4629796" cy="1143160"/>
+            <wp:effectExtent l="0" t="0" r="0" b="0"/>
+            <wp:docPr id="3" name="Imagen 3"/>
             <wp:cNvGraphicFramePr>
               <a:graphicFrameLocks xmlns:a="http://schemas.openxmlformats.org/drawingml/2006/main" noChangeAspect="1"/>
             </wp:cNvGraphicFramePr>
@@ -646,11 +599,17 @@
               <a:graphicData uri="http://schemas.openxmlformats.org/drawingml/2006/picture">
                 <pic:pic xmlns:pic="http://schemas.openxmlformats.org/drawingml/2006/picture">
                   <pic:nvPicPr>
-                    <pic:cNvPr id="2074597179" name=""/>
+                    <pic:cNvPr id="1" name=""/>
                     <pic:cNvPicPr/>
                   </pic:nvPicPr>
                   <pic:blipFill>
-                    <a:blip r:embed="rId12"/>
+                    <a:blip r:embed="rId12">
+                      <a:extLst>
+                        <a:ext uri="{28A0092B-C50C-407E-A947-70E740481C1C}">
+                          <a14:useLocalDpi xmlns:a14="http://schemas.microsoft.com/office/drawing/2010/main" val="0"/>
+                        </a:ext>
+                      </a:extLst>
+                    </a:blip>
                     <a:stretch>
                       <a:fillRect/>
                     </a:stretch>
@@ -658,7 +617,7 @@
                   <pic:spPr>
                     <a:xfrm>
                       <a:off x="0" y="0"/>
-                      <a:ext cx="6151880" cy="3185160"/>
+                      <a:ext cx="4629796" cy="1143160"/>
                     </a:xfrm>
                     <a:prstGeom prst="rect">
                       <a:avLst/>
@@ -670,6 +629,177 @@
           </wp:inline>
         </w:drawing>
       </w:r>
+    </w:p>
+    <w:p>
+      <w:pPr>
+        <w:pStyle w:val="I3E-Normal"/>
+        <w:ind w:firstLine="0"/>
+        <w:jc w:val="left"/>
+      </w:pPr>
+    </w:p>
+    <w:p>
+      <w:pPr>
+        <w:pStyle w:val="I3E-Normal"/>
+        <w:ind w:firstLine="0"/>
+        <w:jc w:val="left"/>
+      </w:pPr>
+      <w:r>
+        <w:lastRenderedPageBreak/>
+        <w:t>Se nos mostrara que inicialiso git flow correctamente y nos mostrara las ramas que maneja esta metodología, naturalmente empezaremos con main que es nuestra rama principal y por consecuencia se creara la rama Develop que es nuestra rama de desarrollo la cual será la base para crear las ramas temporales conocidas como features.</w:t>
+      </w:r>
+    </w:p>
+    <w:p>
+      <w:pPr>
+        <w:pStyle w:val="I3E-Normal"/>
+        <w:ind w:firstLine="0"/>
+        <w:jc w:val="center"/>
+      </w:pPr>
+      <w:r>
+        <w:drawing>
+          <wp:inline distT="0" distB="0" distL="0" distR="0" wp14:anchorId="192B8A07" wp14:editId="365AEAF0">
+            <wp:extent cx="5210902" cy="2915057"/>
+            <wp:effectExtent l="0" t="0" r="0" b="0"/>
+            <wp:docPr id="4" name="Imagen 4"/>
+            <wp:cNvGraphicFramePr>
+              <a:graphicFrameLocks xmlns:a="http://schemas.openxmlformats.org/drawingml/2006/main" noChangeAspect="1"/>
+            </wp:cNvGraphicFramePr>
+            <a:graphic xmlns:a="http://schemas.openxmlformats.org/drawingml/2006/main">
+              <a:graphicData uri="http://schemas.openxmlformats.org/drawingml/2006/picture">
+                <pic:pic xmlns:pic="http://schemas.openxmlformats.org/drawingml/2006/picture">
+                  <pic:nvPicPr>
+                    <pic:cNvPr id="1" name=""/>
+                    <pic:cNvPicPr/>
+                  </pic:nvPicPr>
+                  <pic:blipFill>
+                    <a:blip r:embed="rId13">
+                      <a:extLst>
+                        <a:ext uri="{28A0092B-C50C-407E-A947-70E740481C1C}">
+                          <a14:useLocalDpi xmlns:a14="http://schemas.microsoft.com/office/drawing/2010/main" val="0"/>
+                        </a:ext>
+                      </a:extLst>
+                    </a:blip>
+                    <a:stretch>
+                      <a:fillRect/>
+                    </a:stretch>
+                  </pic:blipFill>
+                  <pic:spPr>
+                    <a:xfrm>
+                      <a:off x="0" y="0"/>
+                      <a:ext cx="5210902" cy="2915057"/>
+                    </a:xfrm>
+                    <a:prstGeom prst="rect">
+                      <a:avLst/>
+                    </a:prstGeom>
+                  </pic:spPr>
+                </pic:pic>
+              </a:graphicData>
+            </a:graphic>
+          </wp:inline>
+        </w:drawing>
+      </w:r>
+    </w:p>
+    <w:p>
+      <w:pPr>
+        <w:pStyle w:val="I3E-Normal"/>
+        <w:ind w:firstLine="0"/>
+      </w:pPr>
+      <w:r>
+        <w:t>Después de crear la rama develop con la configuración de git flow, podremos añadir features en la rama Develop, impotante encontrarse en esta rama.</w:t>
+      </w:r>
+    </w:p>
+    <w:p>
+      <w:pPr>
+        <w:pStyle w:val="I3E-Normal"/>
+        <w:ind w:firstLine="0"/>
+        <w:rPr>
+          <w:lang w:val="en-US"/>
+        </w:rPr>
+      </w:pPr>
+      <w:r>
+        <w:rPr>
+          <w:lang w:val="en-US"/>
+        </w:rPr>
+        <w:t>El código es: “git flow feature start “nombre del feature””</w:t>
+      </w:r>
+    </w:p>
+    <w:p>
+      <w:pPr>
+        <w:pStyle w:val="I3E-Normal"/>
+        <w:ind w:firstLine="0"/>
+        <w:rPr>
+          <w:lang w:val="en-US"/>
+        </w:rPr>
+      </w:pPr>
+      <w:r>
+        <w:rPr>
+          <w:lang w:val="en-US"/>
+        </w:rPr>
+        <w:t xml:space="preserve">Ej: git flow feature start </w:t>
+      </w:r>
+      <w:r>
+        <w:rPr>
+          <w:lang w:val="en-US"/>
+        </w:rPr>
+        <w:t>logica-editar-inventario</w:t>
+      </w:r>
+    </w:p>
+    <w:p>
+      <w:pPr>
+        <w:pStyle w:val="I3E-Normal"/>
+        <w:ind w:firstLine="0"/>
+        <w:jc w:val="center"/>
+        <w:rPr>
+          <w:lang w:val="en-US"/>
+        </w:rPr>
+      </w:pPr>
+      <w:bookmarkStart w:id="0" w:name="_GoBack"/>
+      <w:r>
+        <w:rPr>
+          <w:lang w:val="en-US"/>
+        </w:rPr>
+        <w:drawing>
+          <wp:inline distT="0" distB="0" distL="0" distR="0" wp14:anchorId="38744CE4" wp14:editId="60B68B03">
+            <wp:extent cx="5315692" cy="2743583"/>
+            <wp:effectExtent l="0" t="0" r="0" b="0"/>
+            <wp:docPr id="5" name="Imagen 5"/>
+            <wp:cNvGraphicFramePr>
+              <a:graphicFrameLocks xmlns:a="http://schemas.openxmlformats.org/drawingml/2006/main" noChangeAspect="1"/>
+            </wp:cNvGraphicFramePr>
+            <a:graphic xmlns:a="http://schemas.openxmlformats.org/drawingml/2006/main">
+              <a:graphicData uri="http://schemas.openxmlformats.org/drawingml/2006/picture">
+                <pic:pic xmlns:pic="http://schemas.openxmlformats.org/drawingml/2006/picture">
+                  <pic:nvPicPr>
+                    <pic:cNvPr id="1" name=""/>
+                    <pic:cNvPicPr/>
+                  </pic:nvPicPr>
+                  <pic:blipFill>
+                    <a:blip r:embed="rId14">
+                      <a:extLst>
+                        <a:ext uri="{28A0092B-C50C-407E-A947-70E740481C1C}">
+                          <a14:useLocalDpi xmlns:a14="http://schemas.microsoft.com/office/drawing/2010/main" val="0"/>
+                        </a:ext>
+                      </a:extLst>
+                    </a:blip>
+                    <a:stretch>
+                      <a:fillRect/>
+                    </a:stretch>
+                  </pic:blipFill>
+                  <pic:spPr>
+                    <a:xfrm>
+                      <a:off x="0" y="0"/>
+                      <a:ext cx="5315692" cy="2743583"/>
+                    </a:xfrm>
+                    <a:prstGeom prst="rect">
+                      <a:avLst/>
+                    </a:prstGeom>
+                  </pic:spPr>
+                </pic:pic>
+              </a:graphicData>
+            </a:graphic>
+          </wp:inline>
+        </w:drawing>
+      </w:r>
+      <w:bookmarkEnd w:id="0"/>
     </w:p>
     <w:sectPr>
       <w:type w:val="continuous"/>
@@ -682,7 +812,7 @@
 </file>
 
 <file path=word/endnotes.xml><?xml version="1.0" encoding="utf-8"?>
-<w:endnotes xmlns:wpc="http://schemas.microsoft.com/office/word/2010/wordprocessingCanvas" xmlns:cx="http://schemas.microsoft.com/office/drawing/2014/chartex" xmlns:cx1="http://schemas.microsoft.com/office/drawing/2015/9/8/chartex" xmlns:cx2="http://schemas.microsoft.com/office/drawing/2015/10/21/chartex" xmlns:cx3="http://schemas.microsoft.com/office/drawing/2016/5/9/chartex" xmlns:cx4="http://schemas.microsoft.com/office/drawing/2016/5/10/chartex" xmlns:cx5="http://schemas.microsoft.com/office/drawing/2016/5/11/chartex" xmlns:cx6="http://schemas.microsoft.com/office/drawing/2016/5/12/chartex" xmlns:cx7="http://schemas.microsoft.com/office/drawing/2016/5/13/chartex" xmlns:cx8="http://schemas.microsoft.com/office/drawing/2016/5/14/chartex" xmlns:mc="http://schemas.openxmlformats.org/markup-compatibility/2006" xmlns:aink="http://schemas.microsoft.com/office/drawing/2016/ink" xmlns:am3d="http://schemas.microsoft.com/office/drawing/2017/model3d" xmlns:o="urn:schemas-microsoft-com:office:office" xmlns:oel="http://schemas.microsoft.com/office/2019/extlst" xmlns:r="http://schemas.openxmlformats.org/officeDocument/2006/relationships" xmlns:m="http://schemas.openxmlformats.org/officeDocument/2006/math" xmlns:v="urn:schemas-microsoft-com:vml" xmlns:wp14="http://schemas.microsoft.com/office/word/2010/wordprocessingDrawing" xmlns:wp="http://schemas.openxmlformats.org/drawingml/2006/wordprocessingDrawing" xmlns:w10="urn:schemas-microsoft-com:office:word" xmlns:w="http://schemas.openxmlformats.org/wordprocessingml/2006/main" xmlns:w14="http://schemas.microsoft.com/office/word/2010/wordml" xmlns:w15="http://schemas.microsoft.com/office/word/2012/wordml" xmlns:w16cex="http://schemas.microsoft.com/office/word/2018/wordml/cex" xmlns:w16cid="http://schemas.microsoft.com/office/word/2016/wordml/cid" xmlns:w16="http://schemas.microsoft.com/office/word/2018/wordml" xmlns:w16du="http://schemas.microsoft.com/office/word/2023/wordml/word16du" xmlns:w16sdtdh="http://schemas.microsoft.com/office/word/2020/wordml/sdtdatahash" xmlns:w16sdtfl="http://schemas.microsoft.com/office/word/2024/wordml/sdtformatlock" xmlns:w16se="http://schemas.microsoft.com/office/word/2015/wordml/symex" xmlns:wpg="http://schemas.microsoft.com/office/word/2010/wordprocessingGroup" xmlns:wpi="http://schemas.microsoft.com/office/word/2010/wordprocessingInk" xmlns:wne="http://schemas.microsoft.com/office/word/2006/wordml" xmlns:wps="http://schemas.microsoft.com/office/word/2010/wordprocessingShape" mc:Ignorable="w14 w15 w16se w16cid w16 w16cex w16sdtdh w16sdtfl w16du wp14">
+<w:endnotes xmlns:wpc="http://schemas.microsoft.com/office/word/2010/wordprocessingCanvas" xmlns:cx="http://schemas.microsoft.com/office/drawing/2014/chartex" xmlns:mc="http://schemas.openxmlformats.org/markup-compatibility/2006" xmlns:o="urn:schemas-microsoft-com:office:office" xmlns:r="http://schemas.openxmlformats.org/officeDocument/2006/relationships" xmlns:m="http://schemas.openxmlformats.org/officeDocument/2006/math" xmlns:v="urn:schemas-microsoft-com:vml" xmlns:wp14="http://schemas.microsoft.com/office/word/2010/wordprocessingDrawing" xmlns:wp="http://schemas.openxmlformats.org/drawingml/2006/wordprocessingDrawing" xmlns:w10="urn:schemas-microsoft-com:office:word" xmlns:w="http://schemas.openxmlformats.org/wordprocessingml/2006/main" xmlns:w14="http://schemas.microsoft.com/office/word/2010/wordml" xmlns:w15="http://schemas.microsoft.com/office/word/2012/wordml" xmlns:w16se="http://schemas.microsoft.com/office/word/2015/wordml/symex" xmlns:wpg="http://schemas.microsoft.com/office/word/2010/wordprocessingGroup" xmlns:wpi="http://schemas.microsoft.com/office/word/2010/wordprocessingInk" xmlns:wne="http://schemas.microsoft.com/office/word/2006/wordml" xmlns:wps="http://schemas.microsoft.com/office/word/2010/wordprocessingShape" mc:Ignorable="w14 w15 w16se wp14">
   <w:endnote w:type="separator" w:id="-1">
     <w:p>
       <w:pPr>
@@ -707,7 +837,7 @@
 </file>
 
 <file path=word/footnotes.xml><?xml version="1.0" encoding="utf-8"?>
-<w:footnotes xmlns:wpc="http://schemas.microsoft.com/office/word/2010/wordprocessingCanvas" xmlns:cx="http://schemas.microsoft.com/office/drawing/2014/chartex" xmlns:cx1="http://schemas.microsoft.com/office/drawing/2015/9/8/chartex" xmlns:cx2="http://schemas.microsoft.com/office/drawing/2015/10/21/chartex" xmlns:cx3="http://schemas.microsoft.com/office/drawing/2016/5/9/chartex" xmlns:cx4="http://schemas.microsoft.com/office/drawing/2016/5/10/chartex" xmlns:cx5="http://schemas.microsoft.com/office/drawing/2016/5/11/chartex" xmlns:cx6="http://schemas.microsoft.com/office/drawing/2016/5/12/chartex" xmlns:cx7="http://schemas.microsoft.com/office/drawing/2016/5/13/chartex" xmlns:cx8="http://schemas.microsoft.com/office/drawing/2016/5/14/chartex" xmlns:mc="http://schemas.openxmlformats.org/markup-compatibility/2006" xmlns:aink="http://schemas.microsoft.com/office/drawing/2016/ink" xmlns:am3d="http://schemas.microsoft.com/office/drawing/2017/model3d" xmlns:o="urn:schemas-microsoft-com:office:office" xmlns:oel="http://schemas.microsoft.com/office/2019/extlst" xmlns:r="http://schemas.openxmlformats.org/officeDocument/2006/relationships" xmlns:m="http://schemas.openxmlformats.org/officeDocument/2006/math" xmlns:v="urn:schemas-microsoft-com:vml" xmlns:wp14="http://schemas.microsoft.com/office/word/2010/wordprocessingDrawing" xmlns:wp="http://schemas.openxmlformats.org/drawingml/2006/wordprocessingDrawing" xmlns:w10="urn:schemas-microsoft-com:office:word" xmlns:w="http://schemas.openxmlformats.org/wordprocessingml/2006/main" xmlns:w14="http://schemas.microsoft.com/office/word/2010/wordml" xmlns:w15="http://schemas.microsoft.com/office/word/2012/wordml" xmlns:w16cex="http://schemas.microsoft.com/office/word/2018/wordml/cex" xmlns:w16cid="http://schemas.microsoft.com/office/word/2016/wordml/cid" xmlns:w16="http://schemas.microsoft.com/office/word/2018/wordml" xmlns:w16du="http://schemas.microsoft.com/office/word/2023/wordml/word16du" xmlns:w16sdtdh="http://schemas.microsoft.com/office/word/2020/wordml/sdtdatahash" xmlns:w16sdtfl="http://schemas.microsoft.com/office/word/2024/wordml/sdtformatlock" xmlns:w16se="http://schemas.microsoft.com/office/word/2015/wordml/symex" xmlns:wpg="http://schemas.microsoft.com/office/word/2010/wordprocessingGroup" xmlns:wpi="http://schemas.microsoft.com/office/word/2010/wordprocessingInk" xmlns:wne="http://schemas.microsoft.com/office/word/2006/wordml" xmlns:wps="http://schemas.microsoft.com/office/word/2010/wordprocessingShape" mc:Ignorable="w14 w15 w16se w16cid w16 w16cex w16sdtdh w16sdtfl w16du wp14">
+<w:footnotes xmlns:wpc="http://schemas.microsoft.com/office/word/2010/wordprocessingCanvas" xmlns:cx="http://schemas.microsoft.com/office/drawing/2014/chartex" xmlns:mc="http://schemas.openxmlformats.org/markup-compatibility/2006" xmlns:o="urn:schemas-microsoft-com:office:office" xmlns:r="http://schemas.openxmlformats.org/officeDocument/2006/relationships" xmlns:m="http://schemas.openxmlformats.org/officeDocument/2006/math" xmlns:v="urn:schemas-microsoft-com:vml" xmlns:wp14="http://schemas.microsoft.com/office/word/2010/wordprocessingDrawing" xmlns:wp="http://schemas.openxmlformats.org/drawingml/2006/wordprocessingDrawing" xmlns:w10="urn:schemas-microsoft-com:office:word" xmlns:w="http://schemas.openxmlformats.org/wordprocessingml/2006/main" xmlns:w14="http://schemas.microsoft.com/office/word/2010/wordml" xmlns:w15="http://schemas.microsoft.com/office/word/2012/wordml" xmlns:w16se="http://schemas.microsoft.com/office/word/2015/wordml/symex" xmlns:wpg="http://schemas.microsoft.com/office/word/2010/wordprocessingGroup" xmlns:wpi="http://schemas.microsoft.com/office/word/2010/wordprocessingInk" xmlns:wne="http://schemas.microsoft.com/office/word/2006/wordml" xmlns:wps="http://schemas.microsoft.com/office/word/2010/wordprocessingShape" mc:Ignorable="w14 w15 w16se wp14">
   <w:footnote w:type="separator" w:id="-1">
     <w:p>
       <w:pPr>
@@ -732,7 +862,7 @@
 </file>
 
 <file path=word/styles.xml><?xml version="1.0" encoding="utf-8"?>
-<w:styles xmlns:mc="http://schemas.openxmlformats.org/markup-compatibility/2006" xmlns:r="http://schemas.openxmlformats.org/officeDocument/2006/relationships" xmlns:w="http://schemas.openxmlformats.org/wordprocessingml/2006/main" xmlns:w14="http://schemas.microsoft.com/office/word/2010/wordml" xmlns:w15="http://schemas.microsoft.com/office/word/2012/wordml" xmlns:w16cex="http://schemas.microsoft.com/office/word/2018/wordml/cex" xmlns:w16cid="http://schemas.microsoft.com/office/word/2016/wordml/cid" xmlns:w16="http://schemas.microsoft.com/office/word/2018/wordml" xmlns:w16du="http://schemas.microsoft.com/office/word/2023/wordml/word16du" xmlns:w16sdtdh="http://schemas.microsoft.com/office/word/2020/wordml/sdtdatahash" xmlns:w16sdtfl="http://schemas.microsoft.com/office/word/2024/wordml/sdtformatlock" xmlns:w16se="http://schemas.microsoft.com/office/word/2015/wordml/symex" mc:Ignorable="w14 w15 w16se w16cid w16 w16cex w16sdtdh w16sdtfl w16du">
+<w:styles xmlns:mc="http://schemas.openxmlformats.org/markup-compatibility/2006" xmlns:r="http://schemas.openxmlformats.org/officeDocument/2006/relationships" xmlns:w="http://schemas.openxmlformats.org/wordprocessingml/2006/main" xmlns:w14="http://schemas.microsoft.com/office/word/2010/wordml" xmlns:w15="http://schemas.microsoft.com/office/word/2012/wordml" xmlns:w16se="http://schemas.microsoft.com/office/word/2015/wordml/symex" mc:Ignorable="w14 w15 w16se">
   <w:docDefaults>
     <w:rPrDefault>
       <w:rPr>
@@ -748,7 +878,7 @@
       </w:pPr>
     </w:pPrDefault>
   </w:docDefaults>
-  <w:latentStyles w:defLockedState="0" w:defUIPriority="99" w:defSemiHidden="0" w:defUnhideWhenUsed="0" w:defQFormat="0" w:count="376">
+  <w:latentStyles w:defLockedState="0" w:defUIPriority="99" w:defSemiHidden="0" w:defUnhideWhenUsed="0" w:defQFormat="0" w:count="371">
     <w:lsdException w:name="Normal" w:uiPriority="0" w:qFormat="1"/>
     <w:lsdException w:name="heading 1" w:uiPriority="9" w:qFormat="1"/>
     <w:lsdException w:name="heading 2" w:semiHidden="1" w:uiPriority="9" w:unhideWhenUsed="1" w:qFormat="1"/>
@@ -1120,17 +1250,12 @@
     <w:lsdException w:name="List Table 5 Dark Accent 6" w:uiPriority="50"/>
     <w:lsdException w:name="List Table 6 Colorful Accent 6" w:uiPriority="51"/>
     <w:lsdException w:name="List Table 7 Colorful Accent 6" w:uiPriority="52"/>
-    <w:lsdException w:name="Mention" w:semiHidden="1" w:unhideWhenUsed="1"/>
-    <w:lsdException w:name="Smart Hyperlink" w:semiHidden="1" w:unhideWhenUsed="1"/>
-    <w:lsdException w:name="Hashtag" w:semiHidden="1" w:unhideWhenUsed="1"/>
-    <w:lsdException w:name="Unresolved Mention" w:semiHidden="1" w:unhideWhenUsed="1"/>
-    <w:lsdException w:name="Smart Link" w:semiHidden="1" w:unhideWhenUsed="1"/>
   </w:latentStyles>
   <w:style w:type="paragraph" w:default="1" w:styleId="Normal">
     <w:name w:val="Normal"/>
     <w:qFormat/>
   </w:style>
-  <w:style w:type="paragraph" w:styleId="Heading1">
+  <w:style w:type="paragraph" w:styleId="Ttulo1">
     <w:name w:val="heading 1"/>
     <w:basedOn w:val="Normal"/>
     <w:next w:val="Normal"/>
@@ -1148,7 +1273,7 @@
       <w:szCs w:val="32"/>
     </w:rPr>
   </w:style>
-  <w:style w:type="paragraph" w:styleId="Heading2">
+  <w:style w:type="paragraph" w:styleId="Ttulo2">
     <w:name w:val="heading 2"/>
     <w:basedOn w:val="Normal"/>
     <w:next w:val="Normal"/>
@@ -1169,7 +1294,7 @@
       <w:szCs w:val="36"/>
     </w:rPr>
   </w:style>
-  <w:style w:type="paragraph" w:styleId="Heading3">
+  <w:style w:type="paragraph" w:styleId="Ttulo3">
     <w:name w:val="heading 3"/>
     <w:basedOn w:val="Normal"/>
     <w:next w:val="Normal"/>
@@ -1190,7 +1315,7 @@
       <w:szCs w:val="28"/>
     </w:rPr>
   </w:style>
-  <w:style w:type="paragraph" w:styleId="Heading4">
+  <w:style w:type="paragraph" w:styleId="Ttulo4">
     <w:name w:val="heading 4"/>
     <w:basedOn w:val="Normal"/>
     <w:next w:val="Normal"/>
@@ -1211,7 +1336,7 @@
       <w:szCs w:val="24"/>
     </w:rPr>
   </w:style>
-  <w:style w:type="paragraph" w:styleId="Heading5">
+  <w:style w:type="paragraph" w:styleId="Ttulo5">
     <w:name w:val="heading 5"/>
     <w:basedOn w:val="Normal"/>
     <w:next w:val="Normal"/>
@@ -1230,7 +1355,7 @@
       <w:bCs/>
     </w:rPr>
   </w:style>
-  <w:style w:type="paragraph" w:styleId="Heading6">
+  <w:style w:type="paragraph" w:styleId="Ttulo6">
     <w:name w:val="heading 6"/>
     <w:basedOn w:val="Normal"/>
     <w:next w:val="Normal"/>
@@ -1251,12 +1376,13 @@
       <w:szCs w:val="20"/>
     </w:rPr>
   </w:style>
-  <w:style w:type="character" w:default="1" w:styleId="DefaultParagraphFont">
+  <w:style w:type="character" w:default="1" w:styleId="Fuentedeprrafopredeter">
     <w:name w:val="Default Paragraph Font"/>
     <w:uiPriority w:val="1"/>
+    <w:semiHidden/>
     <w:unhideWhenUsed/>
   </w:style>
-  <w:style w:type="table" w:default="1" w:styleId="TableNormal">
+  <w:style w:type="table" w:default="1" w:styleId="Tablanormal">
     <w:name w:val="Normal Table"/>
     <w:uiPriority w:val="99"/>
     <w:semiHidden/>
@@ -1271,13 +1397,13 @@
       </w:tblCellMar>
     </w:tblPr>
   </w:style>
-  <w:style w:type="numbering" w:default="1" w:styleId="NoList">
+  <w:style w:type="numbering" w:default="1" w:styleId="Sinlista">
     <w:name w:val="No List"/>
     <w:uiPriority w:val="99"/>
     <w:semiHidden/>
     <w:unhideWhenUsed/>
   </w:style>
-  <w:style w:type="table" w:customStyle="1" w:styleId="TableNormal0">
+  <w:style w:type="table" w:customStyle="1" w:styleId="TableNormal">
     <w:name w:val="TableNormal"/>
     <w:tblPr>
       <w:tblCellMar>
@@ -1288,7 +1414,7 @@
       </w:tblCellMar>
     </w:tblPr>
   </w:style>
-  <w:style w:type="paragraph" w:styleId="Title">
+  <w:style w:type="paragraph" w:styleId="Ttulo">
     <w:name w:val="Title"/>
     <w:basedOn w:val="Normal"/>
     <w:next w:val="Normal"/>
@@ -1340,7 +1466,7 @@
   </w:style>
   <w:style w:type="character" w:customStyle="1" w:styleId="I3E-NormalCar">
     <w:name w:val="I3E-Normal Car"/>
-    <w:basedOn w:val="DefaultParagraphFont"/>
+    <w:basedOn w:val="Fuentedeprrafopredeter"/>
     <w:link w:val="I3E-Normal"/>
     <w:rsid w:val="000E74AB"/>
     <w:rPr>
@@ -1394,9 +1520,9 @@
       <w:sz w:val="28"/>
     </w:rPr>
   </w:style>
-  <w:style w:type="character" w:styleId="Hyperlink">
+  <w:style w:type="character" w:styleId="Hipervnculo">
     <w:name w:val="Hyperlink"/>
-    <w:basedOn w:val="DefaultParagraphFont"/>
+    <w:basedOn w:val="Fuentedeprrafopredeter"/>
     <w:uiPriority w:val="99"/>
     <w:unhideWhenUsed/>
     <w:rsid w:val="00B15FF6"/>
@@ -1417,9 +1543,9 @@
       <w:sz w:val="20"/>
     </w:rPr>
   </w:style>
-  <w:style w:type="character" w:styleId="UnresolvedMention">
+  <w:style w:type="character" w:customStyle="1" w:styleId="UnresolvedMention">
     <w:name w:val="Unresolved Mention"/>
-    <w:basedOn w:val="DefaultParagraphFont"/>
+    <w:basedOn w:val="Fuentedeprrafopredeter"/>
     <w:uiPriority w:val="99"/>
     <w:semiHidden/>
     <w:unhideWhenUsed/>
@@ -1429,10 +1555,10 @@
       <w:shd w:val="clear" w:color="auto" w:fill="E1DFDD"/>
     </w:rPr>
   </w:style>
-  <w:style w:type="paragraph" w:styleId="Header">
+  <w:style w:type="paragraph" w:styleId="Encabezado">
     <w:name w:val="header"/>
     <w:basedOn w:val="Normal"/>
-    <w:link w:val="HeaderChar"/>
+    <w:link w:val="EncabezadoCar"/>
     <w:uiPriority w:val="99"/>
     <w:unhideWhenUsed/>
     <w:rsid w:val="00CA3E8E"/>
@@ -1444,17 +1570,17 @@
       <w:spacing w:after="0" w:line="240" w:lineRule="auto"/>
     </w:pPr>
   </w:style>
-  <w:style w:type="character" w:customStyle="1" w:styleId="HeaderChar">
-    <w:name w:val="Header Char"/>
-    <w:basedOn w:val="DefaultParagraphFont"/>
-    <w:link w:val="Header"/>
+  <w:style w:type="character" w:customStyle="1" w:styleId="EncabezadoCar">
+    <w:name w:val="Encabezado Car"/>
+    <w:basedOn w:val="Fuentedeprrafopredeter"/>
+    <w:link w:val="Encabezado"/>
     <w:uiPriority w:val="99"/>
     <w:rsid w:val="00CA3E8E"/>
   </w:style>
-  <w:style w:type="paragraph" w:styleId="Footer">
+  <w:style w:type="paragraph" w:styleId="Piedepgina">
     <w:name w:val="footer"/>
     <w:basedOn w:val="Normal"/>
-    <w:link w:val="FooterChar"/>
+    <w:link w:val="PiedepginaCar"/>
     <w:uiPriority w:val="99"/>
     <w:unhideWhenUsed/>
     <w:rsid w:val="00CA3E8E"/>
@@ -1466,16 +1592,16 @@
       <w:spacing w:after="0" w:line="240" w:lineRule="auto"/>
     </w:pPr>
   </w:style>
-  <w:style w:type="character" w:customStyle="1" w:styleId="FooterChar">
-    <w:name w:val="Footer Char"/>
-    <w:basedOn w:val="DefaultParagraphFont"/>
-    <w:link w:val="Footer"/>
+  <w:style w:type="character" w:customStyle="1" w:styleId="PiedepginaCar">
+    <w:name w:val="Pie de página Car"/>
+    <w:basedOn w:val="Fuentedeprrafopredeter"/>
+    <w:link w:val="Piedepgina"/>
     <w:uiPriority w:val="99"/>
     <w:rsid w:val="00CA3E8E"/>
   </w:style>
-  <w:style w:type="table" w:styleId="TableGrid">
+  <w:style w:type="table" w:styleId="Tablaconcuadrcula">
     <w:name w:val="Table Grid"/>
-    <w:basedOn w:val="TableNormal"/>
+    <w:basedOn w:val="Tablanormal"/>
     <w:uiPriority w:val="39"/>
     <w:rsid w:val="00830197"/>
     <w:pPr>
@@ -1508,7 +1634,7 @@
       <w:i/>
     </w:rPr>
   </w:style>
-  <w:style w:type="paragraph" w:styleId="Caption">
+  <w:style w:type="paragraph" w:styleId="Descripcin">
     <w:name w:val="caption"/>
     <w:basedOn w:val="Normal"/>
     <w:next w:val="Normal"/>
@@ -1584,7 +1710,7 @@
   </w:style>
   <w:style w:type="character" w:customStyle="1" w:styleId="Ttulo1Car">
     <w:name w:val="Título 1 Car"/>
-    <w:basedOn w:val="DefaultParagraphFont"/>
+    <w:basedOn w:val="Fuentedeprrafopredeter"/>
     <w:uiPriority w:val="9"/>
     <w:rsid w:val="00912BCC"/>
     <w:rPr>
@@ -1607,7 +1733,7 @@
       <w:sz w:val="18"/>
     </w:rPr>
   </w:style>
-  <w:style w:type="paragraph" w:styleId="Bibliography">
+  <w:style w:type="paragraph" w:styleId="Bibliografa">
     <w:name w:val="Bibliography"/>
     <w:basedOn w:val="Normal"/>
     <w:next w:val="Normal"/>
@@ -1615,7 +1741,7 @@
     <w:unhideWhenUsed/>
     <w:rsid w:val="00912BCC"/>
   </w:style>
-  <w:style w:type="paragraph" w:styleId="Subtitle">
+  <w:style w:type="paragraph" w:styleId="Subttulo">
     <w:name w:val="Subtitle"/>
     <w:basedOn w:val="Normal"/>
     <w:next w:val="Normal"/>
@@ -1636,7 +1762,7 @@
     </w:rPr>
   </w:style>
   <w:style w:type="table" w:customStyle="1" w:styleId="a">
-    <w:basedOn w:val="TableNormal0"/>
+    <w:basedOn w:val="TableNormal"/>
     <w:pPr>
       <w:spacing w:after="0" w:line="240" w:lineRule="auto"/>
     </w:pPr>
@@ -1652,7 +1778,7 @@
     </w:tblPr>
   </w:style>
   <w:style w:type="table" w:customStyle="1" w:styleId="a0">
-    <w:basedOn w:val="TableNormal0"/>
+    <w:basedOn w:val="TableNormal"/>
     <w:tblPr>
       <w:tblStyleRowBandSize w:val="1"/>
       <w:tblStyleColBandSize w:val="1"/>
@@ -1664,7 +1790,7 @@
       </w:tblCellMar>
     </w:tblPr>
   </w:style>
-  <w:style w:type="paragraph" w:styleId="NoSpacing">
+  <w:style w:type="paragraph" w:styleId="Sinespaciado">
     <w:name w:val="No Spacing"/>
     <w:uiPriority w:val="1"/>
     <w:qFormat/>

</xml_diff>